<commit_message>
Update portfolio consistency, README, and resume
</commit_message>
<xml_diff>
--- a/public/Tiberiu-Ioan_Boscan_resume.docx
+++ b/public/Tiberiu-Ioan_Boscan_resume.docx
@@ -14,7 +14,7 @@
           <w:color w:val="111827"/>
           <w:sz w:val="36"/>
         </w:rPr>
-        <w:t>TIBERIU-IOAN BOSCAN</w:t>
+        <w:t>TIBERIU-IOAN BOȘCAN</w:t>
         <w:br/>
       </w:r>
       <w:r>
@@ -24,7 +24,7 @@
           <w:color w:val="0070C0"/>
           <w:sz w:val="21"/>
         </w:rPr>
-        <w:t>Full Stack Developer</w:t>
+        <w:t>Software Developer</w:t>
         <w:br/>
       </w:r>
     </w:p>
@@ -145,7 +145,7 @@
           <w:color w:val="111827"/>
           <w:sz w:val="18"/>
         </w:rPr>
-        <w:t>Full Stack Developer with 3+ years of hands-on experience building enterprise fintech CFD trading platforms, analytical laboratory instrumentation suites, and deep learning computer vision models. Strong expertise across Java, Spring Boot, React, TypeScript, C#, Angular, and Python. Proven track record in distributed systems, automating CI/CD release pipelines, and actively leveraging AI coding agents to accelerate delivery.</w:t>
+        <w:t>Software Developer with 3+ years of hands-on experience building enterprise fintech CFD trading platforms, analytical laboratory instrumentation suites, and deep learning computer vision models. Strong expertise across Java, Spring Boot, React, TypeScript, C#, Angular, and Python. Proven track record in distributed systems, automating CI/CD release pipelines, and actively leveraging AI coding agents to accelerate delivery.</w:t>
       </w:r>
     </w:p>
     <w:p>
@@ -382,7 +382,7 @@
           <w:color w:val="111827"/>
           <w:sz w:val="18"/>
         </w:rPr>
-        <w:t>Implemented the CFD trading platform's modular workspace and dockable layout system using React and Dockview, delivering 8+ high-performance interactive panel components.</w:t>
+        <w:t>Implemented the CFD trading platform's modular workspace and dockable layout system using React and Dockview, delivering 8+ high‑performance interactive panel components.</w:t>
       </w:r>
     </w:p>
     <w:p>
@@ -1005,7 +1005,7 @@
           <w:color w:val="0070C0"/>
           <w:sz w:val="18"/>
         </w:rPr>
-        <w:t>UI/UX Designer &amp; Full Stack Web Developer</w:t>
+        <w:t>UI/UX Designer &amp; Full-Stack Web Developer</w:t>
       </w:r>
       <w:r>
         <w:rPr>

</xml_diff>

<commit_message>
Update resume and potfolio
</commit_message>
<xml_diff>
--- a/public/Tiberiu-Ioan_Boscan_resume.docx
+++ b/public/Tiberiu-Ioan_Boscan_resume.docx
@@ -295,7 +295,7 @@
           <w:color w:val="111827"/>
           <w:sz w:val="18"/>
         </w:rPr>
-        <w:t>AI Coding Agents, PyTorch, OpenCV, Vision Transformers (ViT), LoRA, YOLOv8, CNNs, Hugging Face</w:t>
+        <w:t>PyTorch, OpenCV, Vision Transformers (ViT), LoRA, YOLOv8, CNNs, Hugging Face</w:t>
       </w:r>
     </w:p>
     <w:p>
@@ -1606,7 +1606,7 @@
     </w:p>
     <w:p>
       <w:pPr>
-        <w:spacing w:after="36"/>
+        <w:spacing w:after="0"/>
       </w:pPr>
       <w:r>
         <w:rPr>

</xml_diff>

<commit_message>
Update portfolio consistency, README, and resume (#2)
</commit_message>
<xml_diff>
--- a/public/Tiberiu-Ioan_Boscan_resume.docx
+++ b/public/Tiberiu-Ioan_Boscan_resume.docx
@@ -14,7 +14,7 @@
           <w:color w:val="111827"/>
           <w:sz w:val="36"/>
         </w:rPr>
-        <w:t>TIBERIU-IOAN BOSCAN</w:t>
+        <w:t>TIBERIU-IOAN BOȘCAN</w:t>
         <w:br/>
       </w:r>
       <w:r>
@@ -24,7 +24,7 @@
           <w:color w:val="0070C0"/>
           <w:sz w:val="21"/>
         </w:rPr>
-        <w:t>Full Stack Developer</w:t>
+        <w:t>Software Developer</w:t>
         <w:br/>
       </w:r>
     </w:p>
@@ -145,7 +145,7 @@
           <w:color w:val="111827"/>
           <w:sz w:val="18"/>
         </w:rPr>
-        <w:t>Full Stack Developer with 3+ years of hands-on experience building enterprise fintech CFD trading platforms, analytical laboratory instrumentation suites, and deep learning computer vision models. Strong expertise across Java, Spring Boot, React, TypeScript, C#, Angular, and Python. Proven track record in distributed systems, automating CI/CD release pipelines, and actively leveraging AI coding agents to accelerate delivery.</w:t>
+        <w:t>Software Developer with 3+ years of hands-on experience building enterprise fintech CFD trading platforms, analytical laboratory instrumentation suites, and deep learning computer vision models. Strong expertise across Java, Spring Boot, React, TypeScript, C#, Angular, and Python. Proven track record in distributed systems, automating CI/CD release pipelines, and actively leveraging AI coding agents to accelerate delivery.</w:t>
       </w:r>
     </w:p>
     <w:p>
@@ -295,7 +295,7 @@
           <w:color w:val="111827"/>
           <w:sz w:val="18"/>
         </w:rPr>
-        <w:t>AI Coding Agents, PyTorch, OpenCV, Vision Transformers (ViT), LoRA, YOLOv8, CNNs, Hugging Face</w:t>
+        <w:t>PyTorch, OpenCV, Vision Transformers (ViT), LoRA, YOLOv8, CNNs, Hugging Face</w:t>
       </w:r>
     </w:p>
     <w:p>
@@ -382,7 +382,7 @@
           <w:color w:val="111827"/>
           <w:sz w:val="18"/>
         </w:rPr>
-        <w:t>Implemented the CFD trading platform's modular workspace and dockable layout system using React and Dockview, delivering 8+ high-performance interactive panel components.</w:t>
+        <w:t>Implemented the CFD trading platform's modular workspace and dockable layout system using React and Dockview, delivering 8+ high‑performance interactive panel components.</w:t>
       </w:r>
     </w:p>
     <w:p>
@@ -1005,7 +1005,7 @@
           <w:color w:val="0070C0"/>
           <w:sz w:val="18"/>
         </w:rPr>
-        <w:t>UI/UX Designer &amp; Full Stack Web Developer</w:t>
+        <w:t>UI/UX Designer &amp; Full-Stack Web Developer</w:t>
       </w:r>
       <w:r>
         <w:rPr>
@@ -1036,7 +1036,7 @@
           <w:color w:val="111827"/>
           <w:sz w:val="18"/>
         </w:rPr>
-        <w:t>Designed and developed 4 custom WordPress websites as a freelance UI/UX Designer, delivering modern, business-specific solutions tailored to each client's needs.</w:t>
+        <w:t>Designed and developed 4 client websites from concept to launch, creating UI mockups and prototypes in Figma alongside custom branding.</w:t>
       </w:r>
     </w:p>
     <w:p>
@@ -1058,7 +1058,7 @@
           <w:color w:val="111827"/>
           <w:sz w:val="18"/>
         </w:rPr>
-        <w:t>Created user-focused interfaces in Figma, including custom logos for 3 of the 4 projects, emphasizing clean, accessible, and responsive design.</w:t>
+        <w:t>Built responsive web applications integrating custom booking workflows, automated contact forms, and real-time client chat.</w:t>
       </w:r>
     </w:p>
     <w:p>
@@ -1080,29 +1080,7 @@
           <w:color w:val="111827"/>
           <w:sz w:val="18"/>
         </w:rPr>
-        <w:t>Integrated booking forms, contact forms, and live chat into fully responsive WordPress sites, enhancing user engagement and client conversion.</w:t>
-      </w:r>
-    </w:p>
-    <w:p>
-      <w:pPr>
-        <w:spacing w:before="0" w:after="40" w:line="269" w:lineRule="auto"/>
-        <w:ind w:left="259" w:hanging="259"/>
-      </w:pPr>
-      <w:r>
-        <w:rPr>
-          <w:rFonts w:ascii="Calibri" w:hAnsi="Calibri"/>
-          <w:color w:val="111827"/>
-          <w:sz w:val="18"/>
-        </w:rPr>
-        <w:t xml:space="preserve">•  </w:t>
-      </w:r>
-      <w:r>
-        <w:rPr>
-          <w:rFonts w:ascii="Calibri" w:hAnsi="Calibri"/>
-          <w:color w:val="111827"/>
-          <w:sz w:val="18"/>
-        </w:rPr>
-        <w:t>Earned a 100% 5-star client satisfaction rating on Upwork for timely delivery, clear communication, and high-quality results.</w:t>
+        <w:t>Maintained a 100% 5-star client satisfaction rating on Upwork for clear communication, high UI fidelity, and on-time project delivery.</w:t>
       </w:r>
     </w:p>
     <w:p>
@@ -1606,7 +1584,7 @@
     </w:p>
     <w:p>
       <w:pPr>
-        <w:spacing w:after="36"/>
+        <w:spacing w:after="0"/>
       </w:pPr>
       <w:r>
         <w:rPr>

</xml_diff>

<commit_message>
Update ui and resume
</commit_message>
<xml_diff>
--- a/public/Tiberiu-Ioan_Boscan_resume.docx
+++ b/public/Tiberiu-Ioan_Boscan_resume.docx
@@ -144,7 +144,7 @@
           <w:color w:val="111827"/>
           <w:sz w:val="18"/>
         </w:rPr>
-        <w:t>Software Developer with 3+ years of hands-on experience building enterprise fintech CFD trading platforms, analytical laboratory instrumentation suites, and deep learning computer vision models. Strong expertise across Java, Spring Boot, React, TypeScript, C#, Angular, and Python. Proven track record in distributed systems, automating CI/CD release pipelines, and actively leveraging AI coding agents to accelerate delivery.</w:t>
+        <w:t>Software Developer with 3+ years of experience building software for financial trading and analytical instrumentation, and developing a deep-learning computer vision thesis project. Core technologies include Java, Spring Boot, React, TypeScript, C#, Angular, and Python. Work includes backend services and interfaces, test automation, and CI/CD pipelines.</w:t>
       </w:r>
     </w:p>
     <w:p>
@@ -383,7 +383,7 @@
           <w:color w:val="111827"/>
           <w:sz w:val="18"/>
         </w:rPr>
-        <w:t>Implemented the CFD trading platform's modular workspace and dockable layout system using React and Dockview, delivering 8+ high-performance interactive panel components.</w:t>
+        <w:t>Implemented the CFD trading platform's modular workspace and dockable layout with React and Dockview, adding 8+ interactive panel components.</w:t>
       </w:r>
     </w:p>
     <w:p>
@@ -449,7 +449,7 @@
           <w:color w:val="111827"/>
           <w:sz w:val="18"/>
         </w:rPr>
-        <w:t>Accelerated frontend modernization from legacy ExtJS to modern component-driven architectures and established automated Jenkins CI/CD pipeline stages to streamline unit testing and zero-downtime deployment.</w:t>
+        <w:t>Contributed to migrating frontend modules from ExtJS to React and added Jenkins pipeline stages for unit-test runs and deployment automation.</w:t>
       </w:r>
     </w:p>
     <w:p>
@@ -471,7 +471,7 @@
           <w:color w:val="111827"/>
           <w:sz w:val="18"/>
         </w:rPr>
-        <w:t>Maintained mission-critical Java &amp; Spring Boot backend microservices, participating in peer code review and co-leading quarterly release cycles focused on security patches and distributed system stability.</w:t>
+        <w:t>Maintained Java and Spring Boot backend microservices, reviewed code, and co-led quarterly releases covering security patches and service stability.</w:t>
       </w:r>
     </w:p>
     <w:p>
@@ -539,7 +539,7 @@
           <w:color w:val="111827"/>
           <w:sz w:val="18"/>
         </w:rPr>
-        <w:t>Optimized end-of-day (EOD) batch processing and SQL database routines, ensuring zero-lag state synchronization across internal ledger systems.</w:t>
+        <w:t>Optimized end-of-day (EOD) batch processing and SQL routines to keep ledger state synchronized across internal systems.</w:t>
       </w:r>
     </w:p>
     <w:p>
@@ -651,7 +651,7 @@
           <w:color w:val="111827"/>
           <w:sz w:val="18"/>
         </w:rPr>
-        <w:t>Recognized by tech leads and business analysts for delivering sprint deliverables ahead of schedule with zero defect regressions.</w:t>
+        <w:t>Improved accessibility across web and mobile trading interfaces.</w:t>
       </w:r>
     </w:p>
     <w:p>
@@ -764,7 +764,7 @@
           <w:color w:val="111827"/>
           <w:sz w:val="18"/>
         </w:rPr>
-        <w:t>Conducted in-depth debugging to diagnose and resolve complex frontend memory leaks and rendering bottlenecks, ensuring continuous 24/7 instrument kiosk stability.</w:t>
+        <w:t>Diagnosed and fixed frontend memory leaks and rendering bottlenecks in Alliance iS HPLC applications.</w:t>
       </w:r>
     </w:p>
     <w:p>
@@ -832,7 +832,7 @@
           <w:color w:val="111827"/>
           <w:sz w:val="18"/>
         </w:rPr>
-        <w:t>Overhauled diagnostic logging mechanisms for physical instruments and software emulators, boosting logging clarity, event tracking, and diagnostic speed.</w:t>
+        <w:t>Reworked diagnostic logging for physical instruments and software emulators to make events easier to trace during troubleshooting.</w:t>
       </w:r>
     </w:p>
     <w:p>
@@ -1089,7 +1089,7 @@
           <w:color w:val="111827"/>
           <w:sz w:val="18"/>
         </w:rPr>
-        <w:t>Maintained a 100% 5-star client satisfaction rating on Upwork for clear communication, high UI fidelity, and on-time project delivery.</w:t>
+        <w:t>Received five-star ratings from Upwork clients for communication, interface quality, and on-time delivery.</w:t>
       </w:r>
     </w:p>
     <w:p>
@@ -1188,7 +1188,7 @@
           <w:color w:val="111827"/>
           <w:sz w:val="18"/>
         </w:rPr>
-        <w:t>Surpassed state-of-the-art baselines across 17 generative architectures, achieving 94.66% accuracy on the AIGC benchmark and 90.80% on synthetic face datasets.</w:t>
+        <w:t>Recorded 94.66% accuracy on AIGC-Detection-Benchmark test splits covering 17 generators and 90.80% on the 140k-Real-and-Fake-Faces dataset.</w:t>
       </w:r>
     </w:p>
     <w:p>

</xml_diff>